<commit_message>
Acréscimo de informações ao readme do projeto - Novo membro do grupo.
</commit_message>
<xml_diff>
--- a/docs/PA3_Aula01_AplicandoConhecimento_10720249_Grupo.docx
+++ b/docs/PA3_Aula01_AplicandoConhecimento_10720249_Grupo.docx
@@ -728,7 +728,7 @@
           <w:r>
             <w:fldChar w:fldCharType="separate"/>
           </w:r>
-          <w:hyperlink w:anchor="_Toc223446129" w:history="1">
+          <w:hyperlink w:anchor="_Toc223449496" w:history="1">
             <w:r>
               <w:rPr>
                 <w:rStyle w:val="Hyperlink"/>
@@ -758,7 +758,7 @@
                 <w:noProof/>
                 <w:webHidden/>
               </w:rPr>
-              <w:instrText xml:space="preserve"> PAGEREF _Toc223446129 \h </w:instrText>
+              <w:instrText xml:space="preserve"> PAGEREF _Toc223449496 \h </w:instrText>
             </w:r>
             <w:r>
               <w:rPr>
@@ -805,7 +805,7 @@
               <w14:ligatures w14:val="standardContextual"/>
             </w:rPr>
           </w:pPr>
-          <w:hyperlink w:anchor="_Toc223446130" w:history="1">
+          <w:hyperlink w:anchor="_Toc223449497" w:history="1">
             <w:r>
               <w:rPr>
                 <w:rStyle w:val="Hyperlink"/>
@@ -834,7 +834,7 @@
                 <w:noProof/>
                 <w:webHidden/>
               </w:rPr>
-              <w:instrText xml:space="preserve"> PAGEREF _Toc223446130 \h </w:instrText>
+              <w:instrText xml:space="preserve"> PAGEREF _Toc223449497 \h </w:instrText>
             </w:r>
             <w:r>
               <w:rPr>
@@ -881,7 +881,7 @@
               <w14:ligatures w14:val="standardContextual"/>
             </w:rPr>
           </w:pPr>
-          <w:hyperlink w:anchor="_Toc223446131" w:history="1">
+          <w:hyperlink w:anchor="_Toc223449498" w:history="1">
             <w:r>
               <w:rPr>
                 <w:rStyle w:val="Hyperlink"/>
@@ -910,7 +910,7 @@
                 <w:noProof/>
                 <w:webHidden/>
               </w:rPr>
-              <w:instrText xml:space="preserve"> PAGEREF _Toc223446131 \h </w:instrText>
+              <w:instrText xml:space="preserve"> PAGEREF _Toc223449498 \h </w:instrText>
             </w:r>
             <w:r>
               <w:rPr>
@@ -957,7 +957,7 @@
               <w14:ligatures w14:val="standardContextual"/>
             </w:rPr>
           </w:pPr>
-          <w:hyperlink w:anchor="_Toc223446132" w:history="1">
+          <w:hyperlink w:anchor="_Toc223449499" w:history="1">
             <w:r>
               <w:rPr>
                 <w:rStyle w:val="Hyperlink"/>
@@ -986,7 +986,7 @@
                 <w:noProof/>
                 <w:webHidden/>
               </w:rPr>
-              <w:instrText xml:space="preserve"> PAGEREF _Toc223446132 \h </w:instrText>
+              <w:instrText xml:space="preserve"> PAGEREF _Toc223449499 \h </w:instrText>
             </w:r>
             <w:r>
               <w:rPr>
@@ -1033,7 +1033,7 @@
               <w14:ligatures w14:val="standardContextual"/>
             </w:rPr>
           </w:pPr>
-          <w:hyperlink w:anchor="_Toc223446133" w:history="1">
+          <w:hyperlink w:anchor="_Toc223449500" w:history="1">
             <w:r>
               <w:rPr>
                 <w:rStyle w:val="Hyperlink"/>
@@ -1062,7 +1062,7 @@
                 <w:noProof/>
                 <w:webHidden/>
               </w:rPr>
-              <w:instrText xml:space="preserve"> PAGEREF _Toc223446133 \h </w:instrText>
+              <w:instrText xml:space="preserve"> PAGEREF _Toc223449500 \h </w:instrText>
             </w:r>
             <w:r>
               <w:rPr>
@@ -1109,7 +1109,7 @@
               <w14:ligatures w14:val="standardContextual"/>
             </w:rPr>
           </w:pPr>
-          <w:hyperlink w:anchor="_Toc223446134" w:history="1">
+          <w:hyperlink w:anchor="_Toc223449501" w:history="1">
             <w:r>
               <w:rPr>
                 <w:rStyle w:val="Hyperlink"/>
@@ -1138,7 +1138,7 @@
                 <w:noProof/>
                 <w:webHidden/>
               </w:rPr>
-              <w:instrText xml:space="preserve"> PAGEREF _Toc223446134 \h </w:instrText>
+              <w:instrText xml:space="preserve"> PAGEREF _Toc223449501 \h </w:instrText>
             </w:r>
             <w:r>
               <w:rPr>
@@ -1185,7 +1185,7 @@
               <w14:ligatures w14:val="standardContextual"/>
             </w:rPr>
           </w:pPr>
-          <w:hyperlink w:anchor="_Toc223446135" w:history="1">
+          <w:hyperlink w:anchor="_Toc223449502" w:history="1">
             <w:r>
               <w:rPr>
                 <w:rStyle w:val="Hyperlink"/>
@@ -1215,7 +1215,7 @@
                 <w:noProof/>
                 <w:webHidden/>
               </w:rPr>
-              <w:instrText xml:space="preserve"> PAGEREF _Toc223446135 \h </w:instrText>
+              <w:instrText xml:space="preserve"> PAGEREF _Toc223449502 \h </w:instrText>
             </w:r>
             <w:r>
               <w:rPr>
@@ -1298,7 +1298,7 @@
         </w:rPr>
         <w:br w:type="page"/>
       </w:r>
-      <w:bookmarkStart w:id="0" w:name="_Toc223446129"/>
+      <w:bookmarkStart w:id="0" w:name="_Toc223449496"/>
       <w:r>
         <w:rPr>
           <w:rStyle w:val="Forte"/>
@@ -1355,7 +1355,7 @@
           <w:szCs w:val="24"/>
         </w:rPr>
       </w:pPr>
-      <w:bookmarkStart w:id="1" w:name="_Toc223446130"/>
+      <w:bookmarkStart w:id="1" w:name="_Toc223449497"/>
       <w:r>
         <w:rPr>
           <w:rFonts w:ascii="Arial" w:eastAsia="Arial" w:hAnsi="Arial" w:cs="Arial"/>
@@ -1411,31 +1411,7 @@
           <w:sz w:val="24"/>
           <w:szCs w:val="24"/>
         </w:rPr>
-        <w:t xml:space="preserve">iFood </w:t>
-      </w:r>
-      <w:proofErr w:type="spellStart"/>
-      <w:r>
-        <w:rPr>
-          <w:rFonts w:ascii="Arial" w:eastAsia="Arial" w:hAnsi="Arial" w:cs="Arial"/>
-          <w:i/>
-          <w:iCs/>
-          <w:color w:val="000000" w:themeColor="text1"/>
-          <w:sz w:val="24"/>
-          <w:szCs w:val="24"/>
-        </w:rPr>
-        <w:t>Restaurants</w:t>
-      </w:r>
-      <w:proofErr w:type="spellEnd"/>
-      <w:r>
-        <w:rPr>
-          <w:rFonts w:ascii="Arial" w:eastAsia="Arial" w:hAnsi="Arial" w:cs="Arial"/>
-          <w:i/>
-          <w:iCs/>
-          <w:color w:val="000000" w:themeColor="text1"/>
-          <w:sz w:val="24"/>
-          <w:szCs w:val="24"/>
-        </w:rPr>
-        <w:t xml:space="preserve"> Data</w:t>
+        <w:t>iFood Restaurants Data</w:t>
       </w:r>
       <w:r>
         <w:rPr>
@@ -1444,47 +1420,7 @@
           <w:sz w:val="24"/>
           <w:szCs w:val="24"/>
         </w:rPr>
-        <w:t xml:space="preserve"> (</w:t>
-      </w:r>
-      <w:proofErr w:type="spellStart"/>
-      <w:r>
-        <w:rPr>
-          <w:rFonts w:ascii="Arial" w:eastAsia="Arial" w:hAnsi="Arial" w:cs="Arial"/>
-          <w:color w:val="000000" w:themeColor="text1"/>
-          <w:sz w:val="24"/>
-          <w:szCs w:val="24"/>
-        </w:rPr>
-        <w:t>Kaggle</w:t>
-      </w:r>
-      <w:proofErr w:type="spellEnd"/>
-      <w:r>
-        <w:rPr>
-          <w:rFonts w:ascii="Arial" w:eastAsia="Arial" w:hAnsi="Arial" w:cs="Arial"/>
-          <w:color w:val="000000" w:themeColor="text1"/>
-          <w:sz w:val="24"/>
-          <w:szCs w:val="24"/>
-        </w:rPr>
-        <w:t xml:space="preserve">), utilizando informações descritivas dos estabelecimentos disponíveis no </w:t>
-      </w:r>
-      <w:proofErr w:type="spellStart"/>
-      <w:r>
-        <w:rPr>
-          <w:rFonts w:ascii="Arial" w:eastAsia="Arial" w:hAnsi="Arial" w:cs="Arial"/>
-          <w:color w:val="000000" w:themeColor="text1"/>
-          <w:sz w:val="24"/>
-          <w:szCs w:val="24"/>
-        </w:rPr>
-        <w:t>dataset</w:t>
-      </w:r>
-      <w:proofErr w:type="spellEnd"/>
-      <w:r>
-        <w:rPr>
-          <w:rFonts w:ascii="Arial" w:eastAsia="Arial" w:hAnsi="Arial" w:cs="Arial"/>
-          <w:color w:val="000000" w:themeColor="text1"/>
-          <w:sz w:val="24"/>
-          <w:szCs w:val="24"/>
-        </w:rPr>
-        <w:t>, como categorias, características e demais atributos cadastrados. A motivação central é apoiar o processo de decisão do usuário em um cenário de grande volume de opções, reduzindo o esforço de busca e aumentando a chance de encontrar restaurantes alinhados às suas preferências (por exemplo, tipo de culinária, faixa de preço e localização, quando disponível).</w:t>
+        <w:t xml:space="preserve"> (Kaggle), utilizando informações descritivas dos estabelecimentos disponíveis no dataset, como categorias, características e demais atributos cadastrados. A motivação central é apoiar o processo de decisão do usuário em um cenário de grande volume de opções, reduzindo o esforço de busca e aumentando a chance de encontrar restaurantes alinhados às suas preferências (por exemplo, tipo de culinária, faixa de preço e localização, quando disponível).</w:t>
       </w:r>
     </w:p>
     <w:p>
@@ -1519,47 +1455,7 @@
           <w:sz w:val="24"/>
           <w:szCs w:val="24"/>
         </w:rPr>
-        <w:t xml:space="preserve">A proposta do projeto é construir um </w:t>
-      </w:r>
-      <w:proofErr w:type="spellStart"/>
-      <w:r>
-        <w:rPr>
-          <w:rFonts w:ascii="Arial" w:eastAsia="Arial" w:hAnsi="Arial" w:cs="Arial"/>
-          <w:color w:val="000000" w:themeColor="text1"/>
-          <w:sz w:val="24"/>
-          <w:szCs w:val="24"/>
-        </w:rPr>
-        <w:t>recomendador</w:t>
-      </w:r>
-      <w:proofErr w:type="spellEnd"/>
-      <w:r>
-        <w:rPr>
-          <w:rFonts w:ascii="Arial" w:eastAsia="Arial" w:hAnsi="Arial" w:cs="Arial"/>
-          <w:color w:val="000000" w:themeColor="text1"/>
-          <w:sz w:val="24"/>
-          <w:szCs w:val="24"/>
-        </w:rPr>
-        <w:t xml:space="preserve"> capaz de sugerir restaurantes semelhantes a um restaurante de referência ou a um conjunto de preferências previamente definido, explorando técnicas de recomendação adequadas ao tipo de dado disponível. Como a base contém principalmente dados de itens (restaurantes) e seus atributos, o trabalho enfatiza abordagens baseadas em conteúdo (</w:t>
-      </w:r>
-      <w:proofErr w:type="spellStart"/>
-      <w:r>
-        <w:rPr>
-          <w:rFonts w:ascii="Arial" w:eastAsia="Arial" w:hAnsi="Arial" w:cs="Arial"/>
-          <w:color w:val="000000" w:themeColor="text1"/>
-          <w:sz w:val="24"/>
-          <w:szCs w:val="24"/>
-        </w:rPr>
-        <w:t>content-based</w:t>
-      </w:r>
-      <w:proofErr w:type="spellEnd"/>
-      <w:r>
-        <w:rPr>
-          <w:rFonts w:ascii="Arial" w:eastAsia="Arial" w:hAnsi="Arial" w:cs="Arial"/>
-          <w:color w:val="000000" w:themeColor="text1"/>
-          <w:sz w:val="24"/>
-          <w:szCs w:val="24"/>
-        </w:rPr>
-        <w:t>) e/ou híbridas, combinando a representação estruturada das variáveis (como categorias e atributos) com representação textual (quando houver campos descritivos), de forma a calcular similaridades e gerar rankings de recomendações.</w:t>
+        <w:t>A proposta do projeto é construir um recomendador capaz de sugerir restaurantes semelhantes a um restaurante de referência ou a um conjunto de preferências previamente definido, explorando técnicas de recomendação adequadas ao tipo de dado disponível. Como a base contém principalmente dados de itens (restaurantes) e seus atributos, o trabalho enfatiza abordagens baseadas em conteúdo (content-based) e/ou híbridas, combinando a representação estruturada das variáveis (como categorias e atributos) com representação textual (quando houver campos descritivos), de forma a calcular similaridades e gerar rankings de recomendações.</w:t>
       </w:r>
     </w:p>
     <w:p>
@@ -1594,47 +1490,7 @@
           <w:sz w:val="24"/>
           <w:szCs w:val="24"/>
         </w:rPr>
-        <w:t xml:space="preserve">Além da implementação, o projeto contempla as etapas típicas de um ciclo de ciência de dados: entendimento e preparação dos dados, definição de critérios de qualidade e consistência, construção de um baseline para comparação, modelagem e testes do </w:t>
-      </w:r>
-      <w:proofErr w:type="spellStart"/>
-      <w:r>
-        <w:rPr>
-          <w:rFonts w:ascii="Arial" w:eastAsia="Arial" w:hAnsi="Arial" w:cs="Arial"/>
-          <w:color w:val="000000" w:themeColor="text1"/>
-          <w:sz w:val="24"/>
-          <w:szCs w:val="24"/>
-        </w:rPr>
-        <w:t>recomendador</w:t>
-      </w:r>
-      <w:proofErr w:type="spellEnd"/>
-      <w:r>
-        <w:rPr>
-          <w:rFonts w:ascii="Arial" w:eastAsia="Arial" w:hAnsi="Arial" w:cs="Arial"/>
-          <w:color w:val="000000" w:themeColor="text1"/>
-          <w:sz w:val="24"/>
-          <w:szCs w:val="24"/>
-        </w:rPr>
-        <w:t xml:space="preserve">, e apresentação dos resultados. Por fim, serão discutidas limitações inerentes ao </w:t>
-      </w:r>
-      <w:proofErr w:type="spellStart"/>
-      <w:r>
-        <w:rPr>
-          <w:rFonts w:ascii="Arial" w:eastAsia="Arial" w:hAnsi="Arial" w:cs="Arial"/>
-          <w:color w:val="000000" w:themeColor="text1"/>
-          <w:sz w:val="24"/>
-          <w:szCs w:val="24"/>
-        </w:rPr>
-        <w:t>dataset</w:t>
-      </w:r>
-      <w:proofErr w:type="spellEnd"/>
-      <w:r>
-        <w:rPr>
-          <w:rFonts w:ascii="Arial" w:eastAsia="Arial" w:hAnsi="Arial" w:cs="Arial"/>
-          <w:color w:val="000000" w:themeColor="text1"/>
-          <w:sz w:val="24"/>
-          <w:szCs w:val="24"/>
-        </w:rPr>
-        <w:t xml:space="preserve"> e ao contexto (por exemplo, ausência de histórico real de interações de usuários, quando aplicável), bem como possíveis evoluções, como incorporar feedback do usuário, incluir dados de comportamento e aprimorar a avaliação com métricas de ranking e validação em cenários mais próximos de produção.</w:t>
+        <w:t>Além da implementação, o projeto contempla as etapas típicas de um ciclo de ciência de dados: entendimento e preparação dos dados, definição de critérios de qualidade e consistência, construção de um baseline para comparação, modelagem e testes do recomendador, e apresentação dos resultados. Por fim, serão discutidas limitações inerentes ao dataset e ao contexto (por exemplo, ausência de histórico real de interações de usuários, quando aplicável), bem como possíveis evoluções, como incorporar feedback do usuário, incluir dados de comportamento e aprimorar a avaliação com métricas de ranking e validação em cenários mais próximos de produção.</w:t>
       </w:r>
     </w:p>
     <w:p>
@@ -1716,7 +1572,7 @@
           <w:szCs w:val="24"/>
         </w:rPr>
       </w:pPr>
-      <w:bookmarkStart w:id="3" w:name="_Toc223446131"/>
+      <w:bookmarkStart w:id="3" w:name="_Toc223449498"/>
       <w:r>
         <w:rPr>
           <w:rFonts w:ascii="Arial" w:eastAsia="Arial" w:hAnsi="Arial" w:cs="Arial"/>
@@ -1806,8 +1662,7 @@
           <w:szCs w:val="24"/>
         </w:rPr>
       </w:pPr>
-      <w:bookmarkStart w:id="4" w:name="_Toc223446132"/>
-      <w:proofErr w:type="spellStart"/>
+      <w:bookmarkStart w:id="4" w:name="_Toc223449499"/>
       <w:r>
         <w:rPr>
           <w:rFonts w:ascii="Arial" w:eastAsia="Arial" w:hAnsi="Arial" w:cs="Arial"/>
@@ -1816,18 +1671,7 @@
           <w:sz w:val="24"/>
           <w:szCs w:val="24"/>
         </w:rPr>
-        <w:t>Dataset</w:t>
-      </w:r>
-      <w:proofErr w:type="spellEnd"/>
-      <w:r>
-        <w:rPr>
-          <w:rFonts w:ascii="Arial" w:eastAsia="Arial" w:hAnsi="Arial" w:cs="Arial"/>
-          <w:b/>
-          <w:color w:val="000000" w:themeColor="text1"/>
-          <w:sz w:val="24"/>
-          <w:szCs w:val="24"/>
-        </w:rPr>
-        <w:t xml:space="preserve"> Escolhido</w:t>
+        <w:t>Dataset Escolhido</w:t>
       </w:r>
       <w:bookmarkEnd w:id="4"/>
     </w:p>
@@ -1872,27 +1716,7 @@
           <w:sz w:val="24"/>
           <w:szCs w:val="24"/>
         </w:rPr>
-        <w:t xml:space="preserve">O </w:t>
-      </w:r>
-      <w:proofErr w:type="spellStart"/>
-      <w:r>
-        <w:rPr>
-          <w:rFonts w:ascii="Arial" w:eastAsia="Arial" w:hAnsi="Arial" w:cs="Arial"/>
-          <w:color w:val="000000" w:themeColor="text1"/>
-          <w:sz w:val="24"/>
-          <w:szCs w:val="24"/>
-        </w:rPr>
-        <w:t>dataset</w:t>
-      </w:r>
-      <w:proofErr w:type="spellEnd"/>
-      <w:r>
-        <w:rPr>
-          <w:rFonts w:ascii="Arial" w:eastAsia="Arial" w:hAnsi="Arial" w:cs="Arial"/>
-          <w:color w:val="000000" w:themeColor="text1"/>
-          <w:sz w:val="24"/>
-          <w:szCs w:val="24"/>
-        </w:rPr>
-        <w:t xml:space="preserve"> escolhido para o projeto se chama “</w:t>
+        <w:t>O dataset escolhido para o projeto se chama “</w:t>
       </w:r>
       <w:r>
         <w:rPr>
@@ -1903,151 +1727,7 @@
           <w:sz w:val="24"/>
           <w:szCs w:val="24"/>
         </w:rPr>
-        <w:t xml:space="preserve">iFood </w:t>
-      </w:r>
-      <w:proofErr w:type="spellStart"/>
-      <w:r>
-        <w:rPr>
-          <w:rFonts w:ascii="Arial" w:eastAsia="Arial" w:hAnsi="Arial" w:cs="Arial"/>
-          <w:i/>
-          <w:iCs/>
-          <w:color w:val="000000" w:themeColor="text1"/>
-          <w:sz w:val="24"/>
-          <w:szCs w:val="24"/>
-        </w:rPr>
-        <w:t>Restaurants</w:t>
-      </w:r>
-      <w:proofErr w:type="spellEnd"/>
-      <w:r>
-        <w:rPr>
-          <w:rFonts w:ascii="Arial" w:eastAsia="Arial" w:hAnsi="Arial" w:cs="Arial"/>
-          <w:i/>
-          <w:iCs/>
-          <w:color w:val="000000" w:themeColor="text1"/>
-          <w:sz w:val="24"/>
-          <w:szCs w:val="24"/>
-        </w:rPr>
-        <w:t xml:space="preserve"> Data: Data </w:t>
-      </w:r>
-      <w:proofErr w:type="spellStart"/>
-      <w:r>
-        <w:rPr>
-          <w:rFonts w:ascii="Arial" w:eastAsia="Arial" w:hAnsi="Arial" w:cs="Arial"/>
-          <w:i/>
-          <w:iCs/>
-          <w:color w:val="000000" w:themeColor="text1"/>
-          <w:sz w:val="24"/>
-          <w:szCs w:val="24"/>
-        </w:rPr>
-        <w:t>about</w:t>
-      </w:r>
-      <w:proofErr w:type="spellEnd"/>
-      <w:r>
-        <w:rPr>
-          <w:rFonts w:ascii="Arial" w:eastAsia="Arial" w:hAnsi="Arial" w:cs="Arial"/>
-          <w:i/>
-          <w:iCs/>
-          <w:color w:val="000000" w:themeColor="text1"/>
-          <w:sz w:val="24"/>
-          <w:szCs w:val="24"/>
-        </w:rPr>
-        <w:t xml:space="preserve"> </w:t>
-      </w:r>
-      <w:proofErr w:type="spellStart"/>
-      <w:r>
-        <w:rPr>
-          <w:rFonts w:ascii="Arial" w:eastAsia="Arial" w:hAnsi="Arial" w:cs="Arial"/>
-          <w:i/>
-          <w:iCs/>
-          <w:color w:val="000000" w:themeColor="text1"/>
-          <w:sz w:val="24"/>
-          <w:szCs w:val="24"/>
-        </w:rPr>
-        <w:t>the</w:t>
-      </w:r>
-      <w:proofErr w:type="spellEnd"/>
-      <w:r>
-        <w:rPr>
-          <w:rFonts w:ascii="Arial" w:eastAsia="Arial" w:hAnsi="Arial" w:cs="Arial"/>
-          <w:i/>
-          <w:iCs/>
-          <w:color w:val="000000" w:themeColor="text1"/>
-          <w:sz w:val="24"/>
-          <w:szCs w:val="24"/>
-        </w:rPr>
-        <w:t xml:space="preserve"> </w:t>
-      </w:r>
-      <w:proofErr w:type="spellStart"/>
-      <w:r>
-        <w:rPr>
-          <w:rFonts w:ascii="Arial" w:eastAsia="Arial" w:hAnsi="Arial" w:cs="Arial"/>
-          <w:i/>
-          <w:iCs/>
-          <w:color w:val="000000" w:themeColor="text1"/>
-          <w:sz w:val="24"/>
-          <w:szCs w:val="24"/>
-        </w:rPr>
-        <w:t>Restaurants</w:t>
-      </w:r>
-      <w:proofErr w:type="spellEnd"/>
-      <w:r>
-        <w:rPr>
-          <w:rFonts w:ascii="Arial" w:eastAsia="Arial" w:hAnsi="Arial" w:cs="Arial"/>
-          <w:i/>
-          <w:iCs/>
-          <w:color w:val="000000" w:themeColor="text1"/>
-          <w:sz w:val="24"/>
-          <w:szCs w:val="24"/>
-        </w:rPr>
-        <w:t xml:space="preserve"> in </w:t>
-      </w:r>
-      <w:proofErr w:type="spellStart"/>
-      <w:r>
-        <w:rPr>
-          <w:rFonts w:ascii="Arial" w:eastAsia="Arial" w:hAnsi="Arial" w:cs="Arial"/>
-          <w:i/>
-          <w:iCs/>
-          <w:color w:val="000000" w:themeColor="text1"/>
-          <w:sz w:val="24"/>
-          <w:szCs w:val="24"/>
-        </w:rPr>
-        <w:t>Brazil's</w:t>
-      </w:r>
-      <w:proofErr w:type="spellEnd"/>
-      <w:r>
-        <w:rPr>
-          <w:rFonts w:ascii="Arial" w:eastAsia="Arial" w:hAnsi="Arial" w:cs="Arial"/>
-          <w:i/>
-          <w:iCs/>
-          <w:color w:val="000000" w:themeColor="text1"/>
-          <w:sz w:val="24"/>
-          <w:szCs w:val="24"/>
-        </w:rPr>
-        <w:t xml:space="preserve"> </w:t>
-      </w:r>
-      <w:proofErr w:type="spellStart"/>
-      <w:r>
-        <w:rPr>
-          <w:rFonts w:ascii="Arial" w:eastAsia="Arial" w:hAnsi="Arial" w:cs="Arial"/>
-          <w:i/>
-          <w:iCs/>
-          <w:color w:val="000000" w:themeColor="text1"/>
-          <w:sz w:val="24"/>
-          <w:szCs w:val="24"/>
-        </w:rPr>
-        <w:t>biggest</w:t>
-      </w:r>
-      <w:proofErr w:type="spellEnd"/>
-      <w:r>
-        <w:rPr>
-          <w:rFonts w:ascii="Arial" w:eastAsia="Arial" w:hAnsi="Arial" w:cs="Arial"/>
-          <w:i/>
-          <w:iCs/>
-          <w:color w:val="000000" w:themeColor="text1"/>
-          <w:sz w:val="24"/>
-          <w:szCs w:val="24"/>
-        </w:rPr>
-        <w:t xml:space="preserve"> delivery app</w:t>
+        <w:t>iFood Restaurants Data: Data about the Restaurants in Brazil's biggest delivery app</w:t>
       </w:r>
       <w:r>
         <w:rPr>
@@ -2204,7 +1884,7 @@
           <w:szCs w:val="24"/>
         </w:rPr>
       </w:pPr>
-      <w:bookmarkStart w:id="5" w:name="_Toc223446133"/>
+      <w:bookmarkStart w:id="5" w:name="_Toc223449500"/>
       <w:r>
         <w:rPr>
           <w:rFonts w:ascii="Arial" w:eastAsia="Arial" w:hAnsi="Arial" w:cs="Arial"/>
@@ -2358,7 +2038,7 @@
           <w:szCs w:val="24"/>
         </w:rPr>
       </w:pPr>
-      <w:bookmarkStart w:id="6" w:name="_Toc223446134"/>
+      <w:bookmarkStart w:id="6" w:name="_Toc223449501"/>
       <w:r>
         <w:rPr>
           <w:rFonts w:ascii="Arial" w:eastAsia="Arial" w:hAnsi="Arial" w:cs="Arial"/>
@@ -2414,7 +2094,7 @@
           <w:szCs w:val="24"/>
         </w:rPr>
       </w:pPr>
-      <w:bookmarkStart w:id="7" w:name="_Toc223446135"/>
+      <w:bookmarkStart w:id="7" w:name="_Toc223449502"/>
       <w:r>
         <w:rPr>
           <w:rFonts w:ascii="Arial" w:eastAsia="Arial" w:hAnsi="Arial" w:cs="Arial"/>
@@ -2464,47 +2144,7 @@
           <w:sz w:val="24"/>
           <w:szCs w:val="24"/>
         </w:rPr>
-        <w:t xml:space="preserve">TACHINARDI, Ricardo. iFood </w:t>
-      </w:r>
-      <w:proofErr w:type="spellStart"/>
-      <w:r>
-        <w:rPr>
-          <w:rFonts w:ascii="Arial" w:eastAsia="Arial" w:hAnsi="Arial" w:cs="Arial"/>
-          <w:color w:val="000000" w:themeColor="text1"/>
-          <w:sz w:val="24"/>
-          <w:szCs w:val="24"/>
-        </w:rPr>
-        <w:t>Restaurants</w:t>
-      </w:r>
-      <w:proofErr w:type="spellEnd"/>
-      <w:r>
-        <w:rPr>
-          <w:rFonts w:ascii="Arial" w:eastAsia="Arial" w:hAnsi="Arial" w:cs="Arial"/>
-          <w:color w:val="000000" w:themeColor="text1"/>
-          <w:sz w:val="24"/>
-          <w:szCs w:val="24"/>
-        </w:rPr>
-        <w:t xml:space="preserve"> Data [conjunto de dados]. </w:t>
-      </w:r>
-      <w:proofErr w:type="spellStart"/>
-      <w:r>
-        <w:rPr>
-          <w:rFonts w:ascii="Arial" w:eastAsia="Arial" w:hAnsi="Arial" w:cs="Arial"/>
-          <w:color w:val="000000" w:themeColor="text1"/>
-          <w:sz w:val="24"/>
-          <w:szCs w:val="24"/>
-        </w:rPr>
-        <w:t>Kaggle</w:t>
-      </w:r>
-      <w:proofErr w:type="spellEnd"/>
-      <w:r>
-        <w:rPr>
-          <w:rFonts w:ascii="Arial" w:eastAsia="Arial" w:hAnsi="Arial" w:cs="Arial"/>
-          <w:color w:val="000000" w:themeColor="text1"/>
-          <w:sz w:val="24"/>
-          <w:szCs w:val="24"/>
-        </w:rPr>
-        <w:t>, 2021. Disponível em: https://www.kaggle.com/datasets/ricardotachinardi/ifood-restaurants-data. Acesso em: 28 fev. 2026.</w:t>
+        <w:t>TACHINARDI, Ricardo. iFood Restaurants Data [conjunto de dados]. Kaggle, 2021. Disponível em: https://www.kaggle.com/datasets/ricardotachinardi/ifood-restaurants-data. Acesso em: 28 fev. 2026.</w:t>
       </w:r>
     </w:p>
     <w:p>
@@ -2543,27 +2183,7 @@
           <w:sz w:val="24"/>
           <w:szCs w:val="24"/>
         </w:rPr>
-        <w:t>NAÇÕES UNIDAS. Transformando nosso mundo: a Agenda 2030 para o Desenvolvimento Sustentável. [</w:t>
-      </w:r>
-      <w:proofErr w:type="spellStart"/>
-      <w:r>
-        <w:rPr>
-          <w:rFonts w:ascii="Arial" w:eastAsia="Arial" w:hAnsi="Arial" w:cs="Arial"/>
-          <w:color w:val="000000" w:themeColor="text1"/>
-          <w:sz w:val="24"/>
-          <w:szCs w:val="24"/>
-        </w:rPr>
-        <w:t>S.l</w:t>
-      </w:r>
-      <w:proofErr w:type="spellEnd"/>
-      <w:r>
-        <w:rPr>
-          <w:rFonts w:ascii="Arial" w:eastAsia="Arial" w:hAnsi="Arial" w:cs="Arial"/>
-          <w:color w:val="000000" w:themeColor="text1"/>
-          <w:sz w:val="24"/>
-          <w:szCs w:val="24"/>
-        </w:rPr>
-        <w:t>.]: Nações Unidas, 2015. Disponível em: &lt;https://brasil.un.org/sites/default/files/2020-09/agenda2030-pt-br.pdf&gt;. Acesso em: 28 fev. 2026.</w:t>
+        <w:t>NAÇÕES UNIDAS. Transformando nosso mundo: a Agenda 2030 para o Desenvolvimento Sustentável. [S.l.]: Nações Unidas, 2015. Disponível em: &lt;https://brasil.un.org/sites/default/files/2020-09/agenda2030-pt-br.pdf&gt;. Acesso em: 28 fev. 2026.</w:t>
       </w:r>
     </w:p>
     <w:p>
@@ -2602,67 +2222,7 @@
           <w:sz w:val="24"/>
           <w:szCs w:val="24"/>
         </w:rPr>
-        <w:t>NAÇÕES UNIDAS NO BRASIL. Objetivos de Desenvolvimento Sustentável no Brasil. [</w:t>
-      </w:r>
-      <w:proofErr w:type="spellStart"/>
-      <w:r>
-        <w:rPr>
-          <w:rFonts w:ascii="Arial" w:eastAsia="Arial" w:hAnsi="Arial" w:cs="Arial"/>
-          <w:color w:val="000000" w:themeColor="text1"/>
-          <w:sz w:val="24"/>
-          <w:szCs w:val="24"/>
-        </w:rPr>
-        <w:t>S.l</w:t>
-      </w:r>
-      <w:proofErr w:type="spellEnd"/>
-      <w:r>
-        <w:rPr>
-          <w:rFonts w:ascii="Arial" w:eastAsia="Arial" w:hAnsi="Arial" w:cs="Arial"/>
-          <w:color w:val="000000" w:themeColor="text1"/>
-          <w:sz w:val="24"/>
-          <w:szCs w:val="24"/>
-        </w:rPr>
-        <w:t>.]: Nações Unidas no Brasil, [s.d.]. Disponível em: &lt;https://brasil.un.org/</w:t>
-      </w:r>
-      <w:proofErr w:type="spellStart"/>
-      <w:r>
-        <w:rPr>
-          <w:rFonts w:ascii="Arial" w:eastAsia="Arial" w:hAnsi="Arial" w:cs="Arial"/>
-          <w:color w:val="000000" w:themeColor="text1"/>
-          <w:sz w:val="24"/>
-          <w:szCs w:val="24"/>
-        </w:rPr>
-        <w:t>pt-br</w:t>
-      </w:r>
-      <w:proofErr w:type="spellEnd"/>
-      <w:r>
-        <w:rPr>
-          <w:rFonts w:ascii="Arial" w:eastAsia="Arial" w:hAnsi="Arial" w:cs="Arial"/>
-          <w:color w:val="000000" w:themeColor="text1"/>
-          <w:sz w:val="24"/>
-          <w:szCs w:val="24"/>
-        </w:rPr>
-        <w:t>/</w:t>
-      </w:r>
-      <w:proofErr w:type="spellStart"/>
-      <w:r>
-        <w:rPr>
-          <w:rFonts w:ascii="Arial" w:eastAsia="Arial" w:hAnsi="Arial" w:cs="Arial"/>
-          <w:color w:val="000000" w:themeColor="text1"/>
-          <w:sz w:val="24"/>
-          <w:szCs w:val="24"/>
-        </w:rPr>
-        <w:t>sdgs</w:t>
-      </w:r>
-      <w:proofErr w:type="spellEnd"/>
-      <w:r>
-        <w:rPr>
-          <w:rFonts w:ascii="Arial" w:eastAsia="Arial" w:hAnsi="Arial" w:cs="Arial"/>
-          <w:color w:val="000000" w:themeColor="text1"/>
-          <w:sz w:val="24"/>
-          <w:szCs w:val="24"/>
-        </w:rPr>
-        <w:t>&gt;. Acesso em: 28 fev. 2026.</w:t>
+        <w:t>NAÇÕES UNIDAS NO BRASIL. Objetivos de Desenvolvimento Sustentável no Brasil. [S.l.]: Nações Unidas no Brasil, [s.d.]. Disponível em: &lt;https://brasil.un.org/pt-br/sdgs&gt;. Acesso em: 28 fev. 2026.</w:t>
       </w:r>
     </w:p>
     <w:p>
@@ -2701,67 +2261,7 @@
           <w:sz w:val="24"/>
           <w:szCs w:val="24"/>
         </w:rPr>
-        <w:t>NAÇÕES UNIDAS NO BRASIL. Consumo e produção responsáveis (ODS 12). [</w:t>
-      </w:r>
-      <w:proofErr w:type="spellStart"/>
-      <w:r>
-        <w:rPr>
-          <w:rFonts w:ascii="Arial" w:eastAsia="Arial" w:hAnsi="Arial" w:cs="Arial"/>
-          <w:color w:val="000000" w:themeColor="text1"/>
-          <w:sz w:val="24"/>
-          <w:szCs w:val="24"/>
-        </w:rPr>
-        <w:t>S.l</w:t>
-      </w:r>
-      <w:proofErr w:type="spellEnd"/>
-      <w:r>
-        <w:rPr>
-          <w:rFonts w:ascii="Arial" w:eastAsia="Arial" w:hAnsi="Arial" w:cs="Arial"/>
-          <w:color w:val="000000" w:themeColor="text1"/>
-          <w:sz w:val="24"/>
-          <w:szCs w:val="24"/>
-        </w:rPr>
-        <w:t>.]: Nações Unidas no Brasil, [s.d.]. Disponível em: &lt;https://brasil.un.org/</w:t>
-      </w:r>
-      <w:proofErr w:type="spellStart"/>
-      <w:r>
-        <w:rPr>
-          <w:rFonts w:ascii="Arial" w:eastAsia="Arial" w:hAnsi="Arial" w:cs="Arial"/>
-          <w:color w:val="000000" w:themeColor="text1"/>
-          <w:sz w:val="24"/>
-          <w:szCs w:val="24"/>
-        </w:rPr>
-        <w:t>pt-br</w:t>
-      </w:r>
-      <w:proofErr w:type="spellEnd"/>
-      <w:r>
-        <w:rPr>
-          <w:rFonts w:ascii="Arial" w:eastAsia="Arial" w:hAnsi="Arial" w:cs="Arial"/>
-          <w:color w:val="000000" w:themeColor="text1"/>
-          <w:sz w:val="24"/>
-          <w:szCs w:val="24"/>
-        </w:rPr>
-        <w:t>/</w:t>
-      </w:r>
-      <w:proofErr w:type="spellStart"/>
-      <w:r>
-        <w:rPr>
-          <w:rFonts w:ascii="Arial" w:eastAsia="Arial" w:hAnsi="Arial" w:cs="Arial"/>
-          <w:color w:val="000000" w:themeColor="text1"/>
-          <w:sz w:val="24"/>
-          <w:szCs w:val="24"/>
-        </w:rPr>
-        <w:t>sdgs</w:t>
-      </w:r>
-      <w:proofErr w:type="spellEnd"/>
-      <w:r>
-        <w:rPr>
-          <w:rFonts w:ascii="Arial" w:eastAsia="Arial" w:hAnsi="Arial" w:cs="Arial"/>
-          <w:color w:val="000000" w:themeColor="text1"/>
-          <w:sz w:val="24"/>
-          <w:szCs w:val="24"/>
-        </w:rPr>
-        <w:t>/12&gt;. Acesso em: 28 fev. 2026.</w:t>
+        <w:t>NAÇÕES UNIDAS NO BRASIL. Consumo e produção responsáveis (ODS 12). [S.l.]: Nações Unidas no Brasil, [s.d.]. Disponível em: &lt;https://brasil.un.org/pt-br/sdgs/12&gt;. Acesso em: 28 fev. 2026.</w:t>
       </w:r>
     </w:p>
     <w:p>
@@ -2800,67 +2300,7 @@
           <w:sz w:val="24"/>
           <w:szCs w:val="24"/>
         </w:rPr>
-        <w:t>NAÇÕES UNIDAS NO BRASIL. Trabalho decente e crescimento econômico (ODS 8). [</w:t>
-      </w:r>
-      <w:proofErr w:type="spellStart"/>
-      <w:r>
-        <w:rPr>
-          <w:rFonts w:ascii="Arial" w:eastAsia="Arial" w:hAnsi="Arial" w:cs="Arial"/>
-          <w:color w:val="000000" w:themeColor="text1"/>
-          <w:sz w:val="24"/>
-          <w:szCs w:val="24"/>
-        </w:rPr>
-        <w:t>S.l</w:t>
-      </w:r>
-      <w:proofErr w:type="spellEnd"/>
-      <w:r>
-        <w:rPr>
-          <w:rFonts w:ascii="Arial" w:eastAsia="Arial" w:hAnsi="Arial" w:cs="Arial"/>
-          <w:color w:val="000000" w:themeColor="text1"/>
-          <w:sz w:val="24"/>
-          <w:szCs w:val="24"/>
-        </w:rPr>
-        <w:t>.]: Nações Unidas no Brasil, [s.d.]. Disponível em: &lt;https://brasil.un.org/</w:t>
-      </w:r>
-      <w:proofErr w:type="spellStart"/>
-      <w:r>
-        <w:rPr>
-          <w:rFonts w:ascii="Arial" w:eastAsia="Arial" w:hAnsi="Arial" w:cs="Arial"/>
-          <w:color w:val="000000" w:themeColor="text1"/>
-          <w:sz w:val="24"/>
-          <w:szCs w:val="24"/>
-        </w:rPr>
-        <w:t>pt-br</w:t>
-      </w:r>
-      <w:proofErr w:type="spellEnd"/>
-      <w:r>
-        <w:rPr>
-          <w:rFonts w:ascii="Arial" w:eastAsia="Arial" w:hAnsi="Arial" w:cs="Arial"/>
-          <w:color w:val="000000" w:themeColor="text1"/>
-          <w:sz w:val="24"/>
-          <w:szCs w:val="24"/>
-        </w:rPr>
-        <w:t>/</w:t>
-      </w:r>
-      <w:proofErr w:type="spellStart"/>
-      <w:r>
-        <w:rPr>
-          <w:rFonts w:ascii="Arial" w:eastAsia="Arial" w:hAnsi="Arial" w:cs="Arial"/>
-          <w:color w:val="000000" w:themeColor="text1"/>
-          <w:sz w:val="24"/>
-          <w:szCs w:val="24"/>
-        </w:rPr>
-        <w:t>sdgs</w:t>
-      </w:r>
-      <w:proofErr w:type="spellEnd"/>
-      <w:r>
-        <w:rPr>
-          <w:rFonts w:ascii="Arial" w:eastAsia="Arial" w:hAnsi="Arial" w:cs="Arial"/>
-          <w:color w:val="000000" w:themeColor="text1"/>
-          <w:sz w:val="24"/>
-          <w:szCs w:val="24"/>
-        </w:rPr>
-        <w:t>/8&gt;. Acesso em: 28 fev. 2026.</w:t>
+        <w:t>NAÇÕES UNIDAS NO BRASIL. Trabalho decente e crescimento econômico (ODS 8). [S.l.]: Nações Unidas no Brasil, [s.d.]. Disponível em: &lt;https://brasil.un.org/pt-br/sdgs/8&gt;. Acesso em: 28 fev. 2026.</w:t>
       </w:r>
     </w:p>
     <w:p>
@@ -2899,67 +2339,7 @@
           <w:sz w:val="24"/>
           <w:szCs w:val="24"/>
         </w:rPr>
-        <w:t>NAÇÕES UNIDAS NO BRASIL. Cidades e comunidades sustentáveis (ODS 11). [</w:t>
-      </w:r>
-      <w:proofErr w:type="spellStart"/>
-      <w:r>
-        <w:rPr>
-          <w:rFonts w:ascii="Arial" w:eastAsia="Arial" w:hAnsi="Arial" w:cs="Arial"/>
-          <w:color w:val="000000" w:themeColor="text1"/>
-          <w:sz w:val="24"/>
-          <w:szCs w:val="24"/>
-        </w:rPr>
-        <w:t>S.l</w:t>
-      </w:r>
-      <w:proofErr w:type="spellEnd"/>
-      <w:r>
-        <w:rPr>
-          <w:rFonts w:ascii="Arial" w:eastAsia="Arial" w:hAnsi="Arial" w:cs="Arial"/>
-          <w:color w:val="000000" w:themeColor="text1"/>
-          <w:sz w:val="24"/>
-          <w:szCs w:val="24"/>
-        </w:rPr>
-        <w:t>.]: Nações Unidas no Brasil, [s.d.]. Disponível em: &lt;https://brasil.un.org/</w:t>
-      </w:r>
-      <w:proofErr w:type="spellStart"/>
-      <w:r>
-        <w:rPr>
-          <w:rFonts w:ascii="Arial" w:eastAsia="Arial" w:hAnsi="Arial" w:cs="Arial"/>
-          <w:color w:val="000000" w:themeColor="text1"/>
-          <w:sz w:val="24"/>
-          <w:szCs w:val="24"/>
-        </w:rPr>
-        <w:t>pt-br</w:t>
-      </w:r>
-      <w:proofErr w:type="spellEnd"/>
-      <w:r>
-        <w:rPr>
-          <w:rFonts w:ascii="Arial" w:eastAsia="Arial" w:hAnsi="Arial" w:cs="Arial"/>
-          <w:color w:val="000000" w:themeColor="text1"/>
-          <w:sz w:val="24"/>
-          <w:szCs w:val="24"/>
-        </w:rPr>
-        <w:t>/</w:t>
-      </w:r>
-      <w:proofErr w:type="spellStart"/>
-      <w:r>
-        <w:rPr>
-          <w:rFonts w:ascii="Arial" w:eastAsia="Arial" w:hAnsi="Arial" w:cs="Arial"/>
-          <w:color w:val="000000" w:themeColor="text1"/>
-          <w:sz w:val="24"/>
-          <w:szCs w:val="24"/>
-        </w:rPr>
-        <w:t>sdgs</w:t>
-      </w:r>
-      <w:proofErr w:type="spellEnd"/>
-      <w:r>
-        <w:rPr>
-          <w:rFonts w:ascii="Arial" w:eastAsia="Arial" w:hAnsi="Arial" w:cs="Arial"/>
-          <w:color w:val="000000" w:themeColor="text1"/>
-          <w:sz w:val="24"/>
-          <w:szCs w:val="24"/>
-        </w:rPr>
-        <w:t>/11&gt;. Acesso em: 28 fev. 2026.</w:t>
+        <w:t>NAÇÕES UNIDAS NO BRASIL. Cidades e comunidades sustentáveis (ODS 11). [S.l.]: Nações Unidas no Brasil, [s.d.]. Disponível em: &lt;https://brasil.un.org/pt-br/sdgs/11&gt;. Acesso em: 28 fev. 2026.</w:t>
       </w:r>
     </w:p>
     <w:sectPr>
@@ -3019,7 +2399,6 @@
         <w:docPartUnique/>
       </w:docPartObj>
     </w:sdtPr>
-    <w:sdtEndPr/>
     <w:sdtContent>
       <w:p>
         <w:pPr>

</xml_diff>